<commit_message>
Build Next.js PUL Global Partners website
</commit_message>
<xml_diff>
--- a/docs/plan/PUL Global Partners Website Redesign Project Management Plan.docx
+++ b/docs/plan/PUL Global Partners Website Redesign Project Management Plan.docx
@@ -33,7 +33,7 @@
     </w:p>
     <w:p>
       <w:r>
-        <w:t>Version 1.0  |  Plan owner: PUL Global Partners  |  Proposed delivery window: 4 to 6 weeks after authorization</w:t>
+        <w:t>Version 1.1  |  Plan owner: PUL Global Partners  |  Delivery window: review build in progress</w:t>
       </w:r>
     </w:p>
     <w:p>
@@ -54,13 +54,7 @@
         <w:spacing w:after="120"/>
       </w:pPr>
       <w:r>
-        <w:rPr>
-          <w:b/>
-        </w:rPr>
-        <w:t>Recommendation.</w:t>
-      </w:r>
-      <w:r>
-        <w:t xml:space="preserve"> Retain WordPress as the content management system and current deployment target. Build a lightweight Blocksy child theme with governed Elementor templates and reusable components. Use PHP, semantic HTML, modern CSS, and minimal JavaScript for custom functionality. Prototype locally, preserve the current public page structure, add approved sections and pages, and deploy only after executive acceptance and a controlled one.com release process.</w:t>
+        <w:t>Recommendation. Build a separate, static-first Next.js App Router website using TypeScript. Preserve the approved PUL page framework and design direction. Manage occasional Insights articles as local MDX files that are versioned with the site and rendered into static article pages. Start without a database, hosted CMS, or server-side content service. Keep the current WordPress website and deployed Vercel review site unchanged; the new application is for local review only until separately accepted and explicitly authorized for release.</w:t>
       </w:r>
     </w:p>
     <w:p>
@@ -68,7 +62,7 @@
         <w:spacing w:after="120"/>
       </w:pPr>
       <w:r>
-        <w:t>This approach balances visual quality, speed, easy internal editing, one.com compatibility, search visibility, and long-term maintainability. A headless React or Next.js rebuild is not recommended for this phase because it would introduce additional hosting, deployment, security, integration, and editorial complexity without a clear business requirement.</w:t>
+        <w:t>This approach matches the user's preference for code-first changes through ongoing collaboration and the expected low volume of routine edits with occasional Insights publishing. MDX avoids the operational overhead of a database or CMS while keeping articles structured and maintainable. The accepted tradeoff is that routine content edits require a developer or agent. Reassess a CMS only if staff need frequent self-service publishing or formal editorial approvals. Next.js does require a supported build and hosting workflow, so production compatibility and release controls must be reviewed separately; this approval does not change the live site.</w:t>
       </w:r>
     </w:p>
     <w:p>
@@ -84,7 +78,7 @@
         <w:pStyle w:val="ListBullet"/>
       </w:pPr>
       <w:r>
-        <w:t>Approve the proposed WordPress architecture and local-first delivery method.</w:t>
+        <w:t>Approve the separate Next.js and TypeScript review build, with MDX for occasional Insights and no database or CMS at outset.</w:t>
       </w:r>
     </w:p>
     <w:p>
@@ -540,7 +534,7 @@
         <w:spacing w:after="120"/>
       </w:pPr>
       <w:r>
-        <w:t>The project will improve PUL Global Partners’ existing website through a controlled redesign and content enrichment program. The work will preserve the current page concept, strengthen visual and editorial quality, add approved capability and past-performance content, introduce appropriate imagery, and prepare a production-ready WordPress package for deployment.</w:t>
+        <w:t>The project will improve PUL Global Partners' digital presence through a controlled redesign and content enrichment program. The work preserves the approved page concept, strengthens visual and editorial quality, adds approved capability and past-performance content, and introduces appropriate imagery. A separate Next.js review build will be prepared without changing the live website; any production package and hosting decision require a later approval gate.</w:t>
       </w:r>
     </w:p>
     <w:p>
@@ -1297,7 +1291,7 @@
         <w:pStyle w:val="ListBullet"/>
       </w:pPr>
       <w:r>
-        <w:t>Discovery confirmation, page inventory, design system, content architecture, wireframes, responsive visual design, local development, WordPress integration, testing, and deployment preparation.</w:t>
+        <w:t>Discovery confirmation, page inventory, design system, content architecture, responsive visual design, a separate Next.js application, testing, local review, and future deployment preparation subject to a separate approval.</w:t>
       </w:r>
     </w:p>
     <w:p>
@@ -1369,7 +1363,7 @@
         <w:pStyle w:val="ListBullet"/>
       </w:pPr>
       <w:r>
-        <w:t>A headless CMS, React or Next.js production architecture, mobile application, customer portal, CRM replacement, e-commerce platform, multilingual translation program, or custom procurement system.</w:t>
+        <w:t>A database, hosted CMS, authenticated portal, CRM replacement, e-commerce platform, multilingual translation program, or custom procurement system in the initial build. Production migration or hosting changes are also excluded until reviewed and approved separately.</w:t>
       </w:r>
     </w:p>
     <w:p>
@@ -1923,76 +1917,31 @@
       <w:tr>
         <w:tc>
           <w:tcPr>
-            <w:tcW w:type="dxa" w:w="1872"/>
-            <w:tcMar>
-              <w:top w:w="90" w:type="dxa"/>
-              <w:start w:w="110" w:type="dxa"/>
-              <w:bottom w:w="90" w:type="dxa"/>
-              <w:end w:w="110" w:type="dxa"/>
-            </w:tcMar>
-            <w:vAlign w:val="center"/>
-            <w:shd w:fill="FFFFFF"/>
-          </w:tcPr>
-          <w:p>
-            <w:r/>
-            <w:r>
-              <w:rPr>
-                <w:rFonts w:ascii="Aptos" w:hAnsi="Aptos"/>
-                <w:b w:val="0"/>
-                <w:color w:val="20272D"/>
-                <w:sz w:val="16"/>
-              </w:rPr>
-              <w:t>CMS</w:t>
-            </w:r>
-          </w:p>
-        </w:tc>
-        <w:tc>
-          <w:tcPr>
-            <w:tcW w:type="dxa" w:w="3168"/>
-            <w:tcMar>
-              <w:top w:w="90" w:type="dxa"/>
-              <w:start w:w="110" w:type="dxa"/>
-              <w:bottom w:w="90" w:type="dxa"/>
-              <w:end w:w="110" w:type="dxa"/>
-            </w:tcMar>
-            <w:vAlign w:val="center"/>
-            <w:shd w:fill="FFFFFF"/>
-          </w:tcPr>
-          <w:p>
-            <w:r/>
-            <w:r>
-              <w:rPr>
-                <w:rFonts w:ascii="Aptos" w:hAnsi="Aptos"/>
-                <w:b w:val="0"/>
-                <w:color w:val="20272D"/>
-                <w:sz w:val="16"/>
-              </w:rPr>
-              <w:t>WordPress</w:t>
-            </w:r>
-          </w:p>
-        </w:tc>
-        <w:tc>
-          <w:tcPr>
-            <w:tcW w:type="dxa" w:w="5184"/>
-            <w:tcMar>
-              <w:top w:w="90" w:type="dxa"/>
-              <w:start w:w="110" w:type="dxa"/>
-              <w:bottom w:w="90" w:type="dxa"/>
-              <w:end w:w="110" w:type="dxa"/>
-            </w:tcMar>
-            <w:vAlign w:val="center"/>
-            <w:shd w:fill="FFFFFF"/>
-          </w:tcPr>
-          <w:p>
-            <w:r/>
-            <w:r>
-              <w:rPr>
-                <w:rFonts w:ascii="Aptos" w:hAnsi="Aptos"/>
-                <w:b w:val="0"/>
-                <w:color w:val="20272D"/>
-                <w:sz w:val="16"/>
-              </w:rPr>
-              <w:t>Matches the current environment, one.com support, staff familiarity, SEO ecosystem, and deployment path.</w:t>
+            <w:tcW w:type="dxa" w:w="3389"/>
+          </w:tcPr>
+          <w:p>
+            <w:r>
+              <w:t>Framework</w:t>
+            </w:r>
+          </w:p>
+        </w:tc>
+        <w:tc>
+          <w:tcPr>
+            <w:tcW w:type="dxa" w:w="3389"/>
+          </w:tcPr>
+          <w:p>
+            <w:r>
+              <w:t>Next.js App Router</w:t>
+            </w:r>
+          </w:p>
+        </w:tc>
+        <w:tc>
+          <w:tcPr>
+            <w:tcW w:type="dxa" w:w="3389"/>
+          </w:tcPr>
+          <w:p>
+            <w:r>
+              <w:t>Provides reusable routes and components with static generation for the corporate site.</w:t>
             </w:r>
           </w:p>
         </w:tc>
@@ -2000,76 +1949,31 @@
       <w:tr>
         <w:tc>
           <w:tcPr>
-            <w:tcW w:type="dxa" w:w="1872"/>
-            <w:tcMar>
-              <w:top w:w="90" w:type="dxa"/>
-              <w:start w:w="110" w:type="dxa"/>
-              <w:bottom w:w="90" w:type="dxa"/>
-              <w:end w:w="110" w:type="dxa"/>
-            </w:tcMar>
-            <w:vAlign w:val="center"/>
-            <w:shd w:fill="F5F7F8"/>
-          </w:tcPr>
-          <w:p>
-            <w:r/>
-            <w:r>
-              <w:rPr>
-                <w:rFonts w:ascii="Aptos" w:hAnsi="Aptos"/>
-                <w:b w:val="0"/>
-                <w:color w:val="20272D"/>
-                <w:sz w:val="16"/>
-              </w:rPr>
-              <w:t>Theme</w:t>
-            </w:r>
-          </w:p>
-        </w:tc>
-        <w:tc>
-          <w:tcPr>
-            <w:tcW w:type="dxa" w:w="3168"/>
-            <w:tcMar>
-              <w:top w:w="90" w:type="dxa"/>
-              <w:start w:w="110" w:type="dxa"/>
-              <w:bottom w:w="90" w:type="dxa"/>
-              <w:end w:w="110" w:type="dxa"/>
-            </w:tcMar>
-            <w:vAlign w:val="center"/>
-            <w:shd w:fill="F5F7F8"/>
-          </w:tcPr>
-          <w:p>
-            <w:r/>
-            <w:r>
-              <w:rPr>
-                <w:rFonts w:ascii="Aptos" w:hAnsi="Aptos"/>
-                <w:b w:val="0"/>
-                <w:color w:val="20272D"/>
-                <w:sz w:val="16"/>
-              </w:rPr>
-              <w:t>Blocksy child theme</w:t>
-            </w:r>
-          </w:p>
-        </w:tc>
-        <w:tc>
-          <w:tcPr>
-            <w:tcW w:type="dxa" w:w="5184"/>
-            <w:tcMar>
-              <w:top w:w="90" w:type="dxa"/>
-              <w:start w:w="110" w:type="dxa"/>
-              <w:bottom w:w="90" w:type="dxa"/>
-              <w:end w:w="110" w:type="dxa"/>
-            </w:tcMar>
-            <w:vAlign w:val="center"/>
-            <w:shd w:fill="F5F7F8"/>
-          </w:tcPr>
-          <w:p>
-            <w:r/>
-            <w:r>
-              <w:rPr>
-                <w:rFonts w:ascii="Aptos" w:hAnsi="Aptos"/>
-                <w:b w:val="0"/>
-                <w:color w:val="20272D"/>
-                <w:sz w:val="16"/>
-              </w:rPr>
-              <w:t>Preserves the existing foundation while isolating custom styles and templates from parent-theme updates.</w:t>
+            <w:tcW w:type="dxa" w:w="3389"/>
+          </w:tcPr>
+          <w:p>
+            <w:r>
+              <w:t>Language</w:t>
+            </w:r>
+          </w:p>
+        </w:tc>
+        <w:tc>
+          <w:tcPr>
+            <w:tcW w:type="dxa" w:w="3389"/>
+          </w:tcPr>
+          <w:p>
+            <w:r>
+              <w:t>TypeScript</w:t>
+            </w:r>
+          </w:p>
+        </w:tc>
+        <w:tc>
+          <w:tcPr>
+            <w:tcW w:type="dxa" w:w="3389"/>
+          </w:tcPr>
+          <w:p>
+            <w:r>
+              <w:t>Adds typed content and component contracts and aligns with established family-site codebases.</w:t>
             </w:r>
           </w:p>
         </w:tc>
@@ -2077,76 +1981,31 @@
       <w:tr>
         <w:tc>
           <w:tcPr>
-            <w:tcW w:type="dxa" w:w="1872"/>
-            <w:tcMar>
-              <w:top w:w="90" w:type="dxa"/>
-              <w:start w:w="110" w:type="dxa"/>
-              <w:bottom w:w="90" w:type="dxa"/>
-              <w:end w:w="110" w:type="dxa"/>
-            </w:tcMar>
-            <w:vAlign w:val="center"/>
-            <w:shd w:fill="FFFFFF"/>
-          </w:tcPr>
-          <w:p>
-            <w:r/>
-            <w:r>
-              <w:rPr>
-                <w:rFonts w:ascii="Aptos" w:hAnsi="Aptos"/>
-                <w:b w:val="0"/>
-                <w:color w:val="20272D"/>
-                <w:sz w:val="16"/>
-              </w:rPr>
-              <w:t>Page composition</w:t>
-            </w:r>
-          </w:p>
-        </w:tc>
-        <w:tc>
-          <w:tcPr>
-            <w:tcW w:type="dxa" w:w="3168"/>
-            <w:tcMar>
-              <w:top w:w="90" w:type="dxa"/>
-              <w:start w:w="110" w:type="dxa"/>
-              <w:bottom w:w="90" w:type="dxa"/>
-              <w:end w:w="110" w:type="dxa"/>
-            </w:tcMar>
-            <w:vAlign w:val="center"/>
-            <w:shd w:fill="FFFFFF"/>
-          </w:tcPr>
-          <w:p>
-            <w:r/>
-            <w:r>
-              <w:rPr>
-                <w:rFonts w:ascii="Aptos" w:hAnsi="Aptos"/>
-                <w:b w:val="0"/>
-                <w:color w:val="20272D"/>
-                <w:sz w:val="16"/>
-              </w:rPr>
-              <w:t>Elementor containers and governed templates</w:t>
-            </w:r>
-          </w:p>
-        </w:tc>
-        <w:tc>
-          <w:tcPr>
-            <w:tcW w:type="dxa" w:w="5184"/>
-            <w:tcMar>
-              <w:top w:w="90" w:type="dxa"/>
-              <w:start w:w="110" w:type="dxa"/>
-              <w:bottom w:w="90" w:type="dxa"/>
-              <w:end w:w="110" w:type="dxa"/>
-            </w:tcMar>
-            <w:vAlign w:val="center"/>
-            <w:shd w:fill="FFFFFF"/>
-          </w:tcPr>
-          <w:p>
-            <w:r/>
-            <w:r>
-              <w:rPr>
-                <w:rFonts w:ascii="Aptos" w:hAnsi="Aptos"/>
-                <w:b w:val="0"/>
-                <w:color w:val="20272D"/>
-                <w:sz w:val="16"/>
-              </w:rPr>
-              <w:t>Provides user-friendly editing while limiting per-widget style duplication and layout drift.</w:t>
+            <w:tcW w:type="dxa" w:w="3389"/>
+          </w:tcPr>
+          <w:p>
+            <w:r>
+              <w:t>Content</w:t>
+            </w:r>
+          </w:p>
+        </w:tc>
+        <w:tc>
+          <w:tcPr>
+            <w:tcW w:type="dxa" w:w="3389"/>
+          </w:tcPr>
+          <w:p>
+            <w:r>
+              <w:t>Local MDX files for Insights; structured page content in source</w:t>
+            </w:r>
+          </w:p>
+        </w:tc>
+        <w:tc>
+          <w:tcPr>
+            <w:tcW w:type="dxa" w:w="3389"/>
+          </w:tcPr>
+          <w:p>
+            <w:r>
+              <w:t>Supports occasional article publishing without a database or CMS; changes remain reviewable in version control.</w:t>
             </w:r>
           </w:p>
         </w:tc>
@@ -2154,76 +2013,31 @@
       <w:tr>
         <w:tc>
           <w:tcPr>
-            <w:tcW w:type="dxa" w:w="1872"/>
-            <w:tcMar>
-              <w:top w:w="90" w:type="dxa"/>
-              <w:start w:w="110" w:type="dxa"/>
-              <w:bottom w:w="90" w:type="dxa"/>
-              <w:end w:w="110" w:type="dxa"/>
-            </w:tcMar>
-            <w:vAlign w:val="center"/>
-            <w:shd w:fill="F5F7F8"/>
-          </w:tcPr>
-          <w:p>
-            <w:r/>
-            <w:r>
-              <w:rPr>
-                <w:rFonts w:ascii="Aptos" w:hAnsi="Aptos"/>
-                <w:b w:val="0"/>
-                <w:color w:val="20272D"/>
-                <w:sz w:val="16"/>
-              </w:rPr>
-              <w:t>Server-side</w:t>
-            </w:r>
-          </w:p>
-        </w:tc>
-        <w:tc>
-          <w:tcPr>
-            <w:tcW w:type="dxa" w:w="3168"/>
-            <w:tcMar>
-              <w:top w:w="90" w:type="dxa"/>
-              <w:start w:w="110" w:type="dxa"/>
-              <w:bottom w:w="90" w:type="dxa"/>
-              <w:end w:w="110" w:type="dxa"/>
-            </w:tcMar>
-            <w:vAlign w:val="center"/>
-            <w:shd w:fill="F5F7F8"/>
-          </w:tcPr>
-          <w:p>
-            <w:r/>
-            <w:r>
-              <w:rPr>
-                <w:rFonts w:ascii="Aptos" w:hAnsi="Aptos"/>
-                <w:b w:val="0"/>
-                <w:color w:val="20272D"/>
-                <w:sz w:val="16"/>
-              </w:rPr>
-              <w:t>PHP compatible with the production WordPress environment</w:t>
-            </w:r>
-          </w:p>
-        </w:tc>
-        <w:tc>
-          <w:tcPr>
-            <w:tcW w:type="dxa" w:w="5184"/>
-            <w:tcMar>
-              <w:top w:w="90" w:type="dxa"/>
-              <w:start w:w="110" w:type="dxa"/>
-              <w:bottom w:w="90" w:type="dxa"/>
-              <w:end w:w="110" w:type="dxa"/>
-            </w:tcMar>
-            <w:vAlign w:val="center"/>
-            <w:shd w:fill="F5F7F8"/>
-          </w:tcPr>
-          <w:p>
-            <w:r/>
-            <w:r>
-              <w:rPr>
-                <w:rFonts w:ascii="Aptos" w:hAnsi="Aptos"/>
-                <w:b w:val="0"/>
-                <w:color w:val="20272D"/>
-                <w:sz w:val="16"/>
-              </w:rPr>
-              <w:t>Native WordPress templates, hooks, metadata, and safe extensibility.</w:t>
+            <w:tcW w:type="dxa" w:w="3389"/>
+          </w:tcPr>
+          <w:p>
+            <w:r>
+              <w:t>Rendering</w:t>
+            </w:r>
+          </w:p>
+        </w:tc>
+        <w:tc>
+          <w:tcPr>
+            <w:tcW w:type="dxa" w:w="3389"/>
+          </w:tcPr>
+          <w:p>
+            <w:r>
+              <w:t>Static-first generation</w:t>
+            </w:r>
+          </w:p>
+        </w:tc>
+        <w:tc>
+          <w:tcPr>
+            <w:tcW w:type="dxa" w:w="3389"/>
+          </w:tcPr>
+          <w:p>
+            <w:r>
+              <w:t>Serves prebuilt pages efficiently and avoids a runtime backend where the content does not require one.</w:t>
             </w:r>
           </w:p>
         </w:tc>
@@ -2231,76 +2045,31 @@
       <w:tr>
         <w:tc>
           <w:tcPr>
-            <w:tcW w:type="dxa" w:w="1872"/>
-            <w:tcMar>
-              <w:top w:w="90" w:type="dxa"/>
-              <w:start w:w="110" w:type="dxa"/>
-              <w:bottom w:w="90" w:type="dxa"/>
-              <w:end w:w="110" w:type="dxa"/>
-            </w:tcMar>
-            <w:vAlign w:val="center"/>
-            <w:shd w:fill="FFFFFF"/>
-          </w:tcPr>
-          <w:p>
-            <w:r/>
-            <w:r>
-              <w:rPr>
-                <w:rFonts w:ascii="Aptos" w:hAnsi="Aptos"/>
-                <w:b w:val="0"/>
-                <w:color w:val="20272D"/>
-                <w:sz w:val="16"/>
-              </w:rPr>
+            <w:tcW w:type="dxa" w:w="3389"/>
+          </w:tcPr>
+          <w:p>
+            <w:r>
               <w:t>Front end</w:t>
             </w:r>
           </w:p>
         </w:tc>
         <w:tc>
           <w:tcPr>
-            <w:tcW w:type="dxa" w:w="3168"/>
-            <w:tcMar>
-              <w:top w:w="90" w:type="dxa"/>
-              <w:start w:w="110" w:type="dxa"/>
-              <w:bottom w:w="90" w:type="dxa"/>
-              <w:end w:w="110" w:type="dxa"/>
-            </w:tcMar>
-            <w:vAlign w:val="center"/>
-            <w:shd w:fill="FFFFFF"/>
-          </w:tcPr>
-          <w:p>
-            <w:r/>
-            <w:r>
-              <w:rPr>
-                <w:rFonts w:ascii="Aptos" w:hAnsi="Aptos"/>
-                <w:b w:val="0"/>
-                <w:color w:val="20272D"/>
-                <w:sz w:val="16"/>
-              </w:rPr>
-              <w:t>Semantic HTML5, modern CSS, CSS custom properties, minimal vanilla JavaScript</w:t>
-            </w:r>
-          </w:p>
-        </w:tc>
-        <w:tc>
-          <w:tcPr>
-            <w:tcW w:type="dxa" w:w="5184"/>
-            <w:tcMar>
-              <w:top w:w="90" w:type="dxa"/>
-              <w:start w:w="110" w:type="dxa"/>
-              <w:bottom w:w="90" w:type="dxa"/>
-              <w:end w:w="110" w:type="dxa"/>
-            </w:tcMar>
-            <w:vAlign w:val="center"/>
-            <w:shd w:fill="FFFFFF"/>
-          </w:tcPr>
-          <w:p>
-            <w:r/>
-            <w:r>
-              <w:rPr>
-                <w:rFonts w:ascii="Aptos" w:hAnsi="Aptos"/>
-                <w:b w:val="0"/>
-                <w:color w:val="20272D"/>
-                <w:sz w:val="16"/>
-              </w:rPr>
-              <w:t>Fast, accessible, maintainable, and free of unnecessary runtime dependencies.</w:t>
+            <w:tcW w:type="dxa" w:w="3389"/>
+          </w:tcPr>
+          <w:p>
+            <w:r>
+              <w:t>Semantic HTML, modern CSS, optimized images, minimal client JavaScript</w:t>
+            </w:r>
+          </w:p>
+        </w:tc>
+        <w:tc>
+          <w:tcPr>
+            <w:tcW w:type="dxa" w:w="3389"/>
+          </w:tcPr>
+          <w:p>
+            <w:r>
+              <w:t>Supports accessibility, performance, responsive layouts, and maintainability.</w:t>
             </w:r>
           </w:p>
         </w:tc>
@@ -2308,76 +2077,31 @@
       <w:tr>
         <w:tc>
           <w:tcPr>
-            <w:tcW w:type="dxa" w:w="1872"/>
-            <w:tcMar>
-              <w:top w:w="90" w:type="dxa"/>
-              <w:start w:w="110" w:type="dxa"/>
-              <w:bottom w:w="90" w:type="dxa"/>
-              <w:end w:w="110" w:type="dxa"/>
-            </w:tcMar>
-            <w:vAlign w:val="center"/>
-            <w:shd w:fill="F5F7F8"/>
-          </w:tcPr>
-          <w:p>
-            <w:r/>
-            <w:r>
-              <w:rPr>
-                <w:rFonts w:ascii="Aptos" w:hAnsi="Aptos"/>
-                <w:b w:val="0"/>
-                <w:color w:val="20272D"/>
-                <w:sz w:val="16"/>
-              </w:rPr>
-              <w:t>Content</w:t>
-            </w:r>
-          </w:p>
-        </w:tc>
-        <w:tc>
-          <w:tcPr>
-            <w:tcW w:type="dxa" w:w="3168"/>
-            <w:tcMar>
-              <w:top w:w="90" w:type="dxa"/>
-              <w:start w:w="110" w:type="dxa"/>
-              <w:bottom w:w="90" w:type="dxa"/>
-              <w:end w:w="110" w:type="dxa"/>
-            </w:tcMar>
-            <w:vAlign w:val="center"/>
-            <w:shd w:fill="F5F7F8"/>
-          </w:tcPr>
-          <w:p>
-            <w:r/>
-            <w:r>
-              <w:rPr>
-                <w:rFonts w:ascii="Aptos" w:hAnsi="Aptos"/>
-                <w:b w:val="0"/>
-                <w:color w:val="20272D"/>
-                <w:sz w:val="16"/>
-              </w:rPr>
-              <w:t>WordPress pages, posts, media library, reusable Elementor/global components</w:t>
-            </w:r>
-          </w:p>
-        </w:tc>
-        <w:tc>
-          <w:tcPr>
-            <w:tcW w:type="dxa" w:w="5184"/>
-            <w:tcMar>
-              <w:top w:w="90" w:type="dxa"/>
-              <w:start w:w="110" w:type="dxa"/>
-              <w:bottom w:w="90" w:type="dxa"/>
-              <w:end w:w="110" w:type="dxa"/>
-            </w:tcMar>
-            <w:vAlign w:val="center"/>
-            <w:shd w:fill="F5F7F8"/>
-          </w:tcPr>
-          <w:p>
-            <w:r/>
-            <w:r>
-              <w:rPr>
-                <w:rFonts w:ascii="Aptos" w:hAnsi="Aptos"/>
-                <w:b w:val="0"/>
-                <w:color w:val="20272D"/>
-                <w:sz w:val="16"/>
-              </w:rPr>
-              <w:t>Allows controlled editorial ownership.</w:t>
+            <w:tcW w:type="dxa" w:w="3389"/>
+          </w:tcPr>
+          <w:p>
+            <w:r>
+              <w:t>Development</w:t>
+            </w:r>
+          </w:p>
+        </w:tc>
+        <w:tc>
+          <w:tcPr>
+            <w:tcW w:type="dxa" w:w="3389"/>
+          </w:tcPr>
+          <w:p>
+            <w:r>
+              <w:t>Separate `next-app/` application; existing prototype retained</w:t>
+            </w:r>
+          </w:p>
+        </w:tc>
+        <w:tc>
+          <w:tcPr>
+            <w:tcW w:type="dxa" w:w="3389"/>
+          </w:tcPr>
+          <w:p>
+            <w:r>
+              <w:t>Enables review without disturbing the deployed website or reference implementation.</w:t>
             </w:r>
           </w:p>
         </w:tc>
@@ -2385,76 +2109,31 @@
       <w:tr>
         <w:tc>
           <w:tcPr>
-            <w:tcW w:type="dxa" w:w="1872"/>
-            <w:tcMar>
-              <w:top w:w="90" w:type="dxa"/>
-              <w:start w:w="110" w:type="dxa"/>
-              <w:bottom w:w="90" w:type="dxa"/>
-              <w:end w:w="110" w:type="dxa"/>
-            </w:tcMar>
-            <w:vAlign w:val="center"/>
-            <w:shd w:fill="FFFFFF"/>
-          </w:tcPr>
-          <w:p>
-            <w:r/>
-            <w:r>
-              <w:rPr>
-                <w:rFonts w:ascii="Aptos" w:hAnsi="Aptos"/>
-                <w:b w:val="0"/>
-                <w:color w:val="20272D"/>
-                <w:sz w:val="16"/>
-              </w:rPr>
-              <w:t>Development</w:t>
-            </w:r>
-          </w:p>
-        </w:tc>
-        <w:tc>
-          <w:tcPr>
-            <w:tcW w:type="dxa" w:w="3168"/>
-            <w:tcMar>
-              <w:top w:w="90" w:type="dxa"/>
-              <w:start w:w="110" w:type="dxa"/>
-              <w:bottom w:w="90" w:type="dxa"/>
-              <w:end w:w="110" w:type="dxa"/>
-            </w:tcMar>
-            <w:vAlign w:val="center"/>
-            <w:shd w:fill="FFFFFF"/>
-          </w:tcPr>
-          <w:p>
-            <w:r/>
-            <w:r>
-              <w:rPr>
-                <w:rFonts w:ascii="Aptos" w:hAnsi="Aptos"/>
-                <w:b w:val="0"/>
-                <w:color w:val="20272D"/>
-                <w:sz w:val="16"/>
-              </w:rPr>
-              <w:t>Local WordPress environment with Git-managed custom code and documentation</w:t>
-            </w:r>
-          </w:p>
-        </w:tc>
-        <w:tc>
-          <w:tcPr>
-            <w:tcW w:type="dxa" w:w="5184"/>
-            <w:tcMar>
-              <w:top w:w="90" w:type="dxa"/>
-              <w:start w:w="110" w:type="dxa"/>
-              <w:bottom w:w="90" w:type="dxa"/>
-              <w:end w:w="110" w:type="dxa"/>
-            </w:tcMar>
-            <w:vAlign w:val="center"/>
-            <w:shd w:fill="FFFFFF"/>
-          </w:tcPr>
-          <w:p>
-            <w:r/>
-            <w:r>
-              <w:rPr>
-                <w:rFonts w:ascii="Aptos" w:hAnsi="Aptos"/>
-                <w:b w:val="0"/>
-                <w:color w:val="20272D"/>
-                <w:sz w:val="16"/>
-              </w:rPr>
-              <w:t>Supports review, repeatability, rollback, and clean handoff.</w:t>
+            <w:tcW w:type="dxa" w:w="3389"/>
+          </w:tcPr>
+          <w:p>
+            <w:r>
+              <w:t>Build output</w:t>
+            </w:r>
+          </w:p>
+        </w:tc>
+        <w:tc>
+          <w:tcPr>
+            <w:tcW w:type="dxa" w:w="3389"/>
+          </w:tcPr>
+          <w:p>
+            <w:r>
+              <w:t>Next.js static export</w:t>
+            </w:r>
+          </w:p>
+        </w:tc>
+        <w:tc>
+          <w:tcPr>
+            <w:tcW w:type="dxa" w:w="3389"/>
+          </w:tcPr>
+          <w:p>
+            <w:r>
+              <w:t>Emits a prebuilt site that can be reviewed locally and deployed to a static host such as one.com or Vercel after a separate release approval.</w:t>
             </w:r>
           </w:p>
         </w:tc>
@@ -2462,76 +2141,31 @@
       <w:tr>
         <w:tc>
           <w:tcPr>
-            <w:tcW w:type="dxa" w:w="1872"/>
-            <w:tcMar>
-              <w:top w:w="90" w:type="dxa"/>
-              <w:start w:w="110" w:type="dxa"/>
-              <w:bottom w:w="90" w:type="dxa"/>
-              <w:end w:w="110" w:type="dxa"/>
-            </w:tcMar>
-            <w:vAlign w:val="center"/>
-            <w:shd w:fill="F5F7F8"/>
-          </w:tcPr>
-          <w:p>
-            <w:r/>
-            <w:r>
-              <w:rPr>
-                <w:rFonts w:ascii="Aptos" w:hAnsi="Aptos"/>
-                <w:b w:val="0"/>
-                <w:color w:val="20272D"/>
-                <w:sz w:val="16"/>
-              </w:rPr>
+            <w:tcW w:type="dxa" w:w="3389"/>
+          </w:tcPr>
+          <w:p>
+            <w:r>
               <w:t>Deployment</w:t>
             </w:r>
           </w:p>
         </w:tc>
         <w:tc>
           <w:tcPr>
-            <w:tcW w:type="dxa" w:w="3168"/>
-            <w:tcMar>
-              <w:top w:w="90" w:type="dxa"/>
-              <w:start w:w="110" w:type="dxa"/>
-              <w:bottom w:w="90" w:type="dxa"/>
-              <w:end w:w="110" w:type="dxa"/>
-            </w:tcMar>
-            <w:vAlign w:val="center"/>
-            <w:shd w:fill="F5F7F8"/>
-          </w:tcPr>
-          <w:p>
-            <w:r/>
-            <w:r>
-              <w:rPr>
-                <w:rFonts w:ascii="Aptos" w:hAnsi="Aptos"/>
-                <w:b w:val="0"/>
-                <w:color w:val="20272D"/>
-                <w:sz w:val="16"/>
-              </w:rPr>
-              <w:t>Staged file/database release to one.com after backup</w:t>
-            </w:r>
-          </w:p>
-        </w:tc>
-        <w:tc>
-          <w:tcPr>
-            <w:tcW w:type="dxa" w:w="5184"/>
-            <w:tcMar>
-              <w:top w:w="90" w:type="dxa"/>
-              <w:start w:w="110" w:type="dxa"/>
-              <w:bottom w:w="90" w:type="dxa"/>
-              <w:end w:w="110" w:type="dxa"/>
-            </w:tcMar>
-            <w:vAlign w:val="center"/>
-            <w:shd w:fill="F5F7F8"/>
-          </w:tcPr>
-          <w:p>
-            <w:r/>
-            <w:r>
-              <w:rPr>
-                <w:rFonts w:ascii="Aptos" w:hAnsi="Aptos"/>
-                <w:b w:val="0"/>
-                <w:color w:val="20272D"/>
-                <w:sz w:val="16"/>
-              </w:rPr>
-              <w:t>Minimizes public-site risk and supports restoration.</w:t>
+            <w:tcW w:type="dxa" w:w="3389"/>
+          </w:tcPr>
+          <w:p>
+            <w:r>
+              <w:t>Not authorized for production</w:t>
+            </w:r>
+          </w:p>
+        </w:tc>
+        <w:tc>
+          <w:tcPr>
+            <w:tcW w:type="dxa" w:w="3389"/>
+          </w:tcPr>
+          <w:p>
+            <w:r>
+              <w:t>No push, Vercel project change, DNS change, or deployment until acceptance, IT review, and explicit release authorization.</w:t>
             </w:r>
           </w:p>
         </w:tc>
@@ -2547,7 +2181,7 @@
         <w:pStyle w:val="Heading2"/>
       </w:pPr>
       <w:r>
-        <w:t>3.2 Why Not a Different Production Language</w:t>
+        <w:t>3.2 Why This Architecture and Its Tradeoffs</w:t>
       </w:r>
     </w:p>
     <w:p>
@@ -2555,7 +2189,7 @@
         <w:spacing w:after="120"/>
       </w:pPr>
       <w:r>
-        <w:t>A modern JavaScript framework could produce a polished frontend, but it would require a separate build pipeline, hosting strategy, content API, preview workflow, security model, and additional maintenance skills. PUL’s present need is an authoritative, fast, editable corporate website, not an application platform. WordPress with disciplined custom development is therefore the lower-risk and more sustainable choice.</w:t>
+        <w:t>Next.js and TypeScript provide a structured, reusable codebase that matches the user's other websites and supports this conversation-led update workflow. Locally authored MDX is proportionate to occasional article publishing and avoids introducing database and CMS operations before they are needed. Those tradeoffs are accepted for the review build. A static export can be hosted on a compatible web server or Vercel without a Node.js runtime, but the exact production host, domain settings, integrations, and release controls still require IT review and separate approval.</w:t>
       </w:r>
     </w:p>
     <w:p>
@@ -5707,6 +5341,24 @@
             <w:shd w:fill="F5F7F8"/>
           </w:tcPr>
           <w:p>
+            <w:r>
+              <w:t>5 Local Next.js build</w:t>
+            </w:r>
+          </w:p>
+        </w:tc>
+        <w:tc>
+          <w:tcPr>
+            <w:tcW w:type="dxa" w:w="1440"/>
+            <w:tcMar>
+              <w:top w:w="90" w:type="dxa"/>
+              <w:start w:w="110" w:type="dxa"/>
+              <w:bottom w:w="90" w:type="dxa"/>
+              <w:end w:w="110" w:type="dxa"/>
+            </w:tcMar>
+            <w:vAlign w:val="center"/>
+            <w:shd w:fill="F5F7F8"/>
+          </w:tcPr>
+          <w:p>
             <w:r/>
             <w:r>
               <w:rPr>
@@ -5715,13 +5367,13 @@
                 <w:color w:val="20272D"/>
                 <w:sz w:val="16"/>
               </w:rPr>
-              <w:t>5 Local WordPress build</w:t>
-            </w:r>
-          </w:p>
-        </w:tc>
-        <w:tc>
-          <w:tcPr>
-            <w:tcW w:type="dxa" w:w="1440"/>
+              <w:t>7 to 10 days</w:t>
+            </w:r>
+          </w:p>
+        </w:tc>
+        <w:tc>
+          <w:tcPr>
+            <w:tcW w:type="dxa" w:w="5256"/>
             <w:tcMar>
               <w:top w:w="90" w:type="dxa"/>
               <w:start w:w="110" w:type="dxa"/>
@@ -5732,21 +5384,14 @@
             <w:shd w:fill="F5F7F8"/>
           </w:tcPr>
           <w:p>
-            <w:r/>
-            <w:r>
-              <w:rPr>
-                <w:rFonts w:ascii="Aptos" w:hAnsi="Aptos"/>
-                <w:b w:val="0"/>
-                <w:color w:val="20272D"/>
-                <w:sz w:val="16"/>
-              </w:rPr>
-              <w:t>7 to 10 days</w:t>
-            </w:r>
-          </w:p>
-        </w:tc>
-        <w:tc>
-          <w:tcPr>
-            <w:tcW w:type="dxa" w:w="5256"/>
+            <w:r>
+              <w:t>Next.js application, MDX content model, reusable pages, responsive implementation</w:t>
+            </w:r>
+          </w:p>
+        </w:tc>
+        <w:tc>
+          <w:tcPr>
+            <w:tcW w:type="dxa" w:w="1728"/>
             <w:tcMar>
               <w:top w:w="90" w:type="dxa"/>
               <w:start w:w="110" w:type="dxa"/>
@@ -5757,40 +5402,8 @@
             <w:shd w:fill="F5F7F8"/>
           </w:tcPr>
           <w:p>
-            <w:r/>
-            <w:r>
-              <w:rPr>
-                <w:rFonts w:ascii="Aptos" w:hAnsi="Aptos"/>
-                <w:b w:val="0"/>
-                <w:color w:val="20272D"/>
-                <w:sz w:val="16"/>
-              </w:rPr>
-              <w:t>Child theme, Elementor templates, components, responsive implementation</w:t>
-            </w:r>
-          </w:p>
-        </w:tc>
-        <w:tc>
-          <w:tcPr>
-            <w:tcW w:type="dxa" w:w="1728"/>
-            <w:tcMar>
-              <w:top w:w="90" w:type="dxa"/>
-              <w:start w:w="110" w:type="dxa"/>
-              <w:bottom w:w="90" w:type="dxa"/>
-              <w:end w:w="110" w:type="dxa"/>
-            </w:tcMar>
-            <w:vAlign w:val="center"/>
-            <w:shd w:fill="F5F7F8"/>
-          </w:tcPr>
-          <w:p>
-            <w:r/>
-            <w:r>
-              <w:rPr>
-                <w:rFonts w:ascii="Aptos" w:hAnsi="Aptos"/>
-                <w:b w:val="0"/>
-                <w:color w:val="20272D"/>
-                <w:sz w:val="16"/>
-              </w:rPr>
-              <w:t>Feature acceptance</w:t>
+            <w:r>
+              <w:t>Local feature review</w:t>
             </w:r>
           </w:p>
         </w:tc>
@@ -6112,13 +5725,7 @@
         <w:spacing w:after="120"/>
       </w:pPr>
       <w:r>
-        <w:rPr>
-          <w:b/>
-        </w:rPr>
-        <w:t>Estimated calendar duration.</w:t>
-      </w:r>
-      <w:r>
-        <w:t xml:space="preserve"> Four to six weeks after authorization, assuming stakeholder feedback within one to two business days, source materials are available, and production access is supplied before deployment.</w:t>
+        <w:t>Estimated calendar duration. The separate local review build proceeds in short increments. Production release timing is not estimated until the hosting model, integrations, IT constraints, and executive approval are confirmed.</w:t>
       </w:r>
     </w:p>
     <w:p>
@@ -8396,15 +8003,8 @@
             <w:shd w:fill="F5F7F8"/>
           </w:tcPr>
           <w:p>
-            <w:r/>
-            <w:r>
-              <w:rPr>
-                <w:rFonts w:ascii="Aptos" w:hAnsi="Aptos"/>
-                <w:b w:val="0"/>
-                <w:color w:val="20272D"/>
-                <w:sz w:val="16"/>
-              </w:rPr>
-              <w:t>Plugin inventory, least privilege, backups, update readiness, secret exclusion, restoration check, production logging.</w:t>
+            <w:r>
+              <w:t>Dependency and build review, secret exclusion, static host configuration, domain and SSL ownership, backups of the current site, restoration check, and release logging.</w:t>
             </w:r>
           </w:p>
         </w:tc>
@@ -8869,6 +8469,24 @@
             <w:shd w:fill="F5F7F8"/>
           </w:tcPr>
           <w:p>
+            <w:r>
+              <w:t>Build and asset performance</w:t>
+            </w:r>
+          </w:p>
+        </w:tc>
+        <w:tc>
+          <w:tcPr>
+            <w:tcW w:type="dxa" w:w="1728"/>
+            <w:tcMar>
+              <w:top w:w="90" w:type="dxa"/>
+              <w:start w:w="110" w:type="dxa"/>
+              <w:bottom w:w="90" w:type="dxa"/>
+              <w:end w:w="110" w:type="dxa"/>
+            </w:tcMar>
+            <w:vAlign w:val="center"/>
+            <w:shd w:fill="F5F7F8"/>
+          </w:tcPr>
+          <w:p>
             <w:r/>
             <w:r>
               <w:rPr>
@@ -8877,13 +8495,31 @@
                 <w:color w:val="20272D"/>
                 <w:sz w:val="16"/>
               </w:rPr>
-              <w:t>Elementor performance overhead</w:t>
-            </w:r>
-          </w:p>
-        </w:tc>
-        <w:tc>
-          <w:tcPr>
-            <w:tcW w:type="dxa" w:w="1728"/>
+              <w:t>Medium / Medium</w:t>
+            </w:r>
+          </w:p>
+        </w:tc>
+        <w:tc>
+          <w:tcPr>
+            <w:tcW w:type="dxa" w:w="5112"/>
+            <w:tcMar>
+              <w:top w:w="90" w:type="dxa"/>
+              <w:start w:w="110" w:type="dxa"/>
+              <w:bottom w:w="90" w:type="dxa"/>
+              <w:end w:w="110" w:type="dxa"/>
+            </w:tcMar>
+            <w:vAlign w:val="center"/>
+            <w:shd w:fill="F5F7F8"/>
+          </w:tcPr>
+          <w:p>
+            <w:r>
+              <w:t>Use static output, optimized WebP imagery, limited client JavaScript, performance budgets, and release checks.</w:t>
+            </w:r>
+          </w:p>
+        </w:tc>
+        <w:tc>
+          <w:tcPr>
+            <w:tcW w:type="dxa" w:w="1224"/>
             <w:tcMar>
               <w:top w:w="90" w:type="dxa"/>
               <w:start w:w="110" w:type="dxa"/>
@@ -8902,21 +8538,23 @@
                 <w:color w:val="20272D"/>
                 <w:sz w:val="16"/>
               </w:rPr>
-              <w:t>Medium / Medium</w:t>
-            </w:r>
-          </w:p>
-        </w:tc>
-        <w:tc>
-          <w:tcPr>
-            <w:tcW w:type="dxa" w:w="5112"/>
-            <w:tcMar>
-              <w:top w:w="90" w:type="dxa"/>
-              <w:start w:w="110" w:type="dxa"/>
-              <w:bottom w:w="90" w:type="dxa"/>
-              <w:end w:w="110" w:type="dxa"/>
-            </w:tcMar>
-            <w:vAlign w:val="center"/>
-            <w:shd w:fill="F5F7F8"/>
+              <w:t>Development Lead</w:t>
+            </w:r>
+          </w:p>
+        </w:tc>
+      </w:tr>
+      <w:tr>
+        <w:tc>
+          <w:tcPr>
+            <w:tcW w:type="dxa" w:w="2448"/>
+            <w:tcMar>
+              <w:top w:w="90" w:type="dxa"/>
+              <w:start w:w="110" w:type="dxa"/>
+              <w:bottom w:w="90" w:type="dxa"/>
+              <w:end w:w="110" w:type="dxa"/>
+            </w:tcMar>
+            <w:vAlign w:val="center"/>
+            <w:shd w:fill="FFFFFF"/>
           </w:tcPr>
           <w:p>
             <w:r/>
@@ -8927,21 +8565,21 @@
                 <w:color w:val="20272D"/>
                 <w:sz w:val="16"/>
               </w:rPr>
-              <w:t>Use containers, reusable templates, global styles, limited add-ons, optimized assets, and performance budgets.</w:t>
-            </w:r>
-          </w:p>
-        </w:tc>
-        <w:tc>
-          <w:tcPr>
-            <w:tcW w:type="dxa" w:w="1224"/>
-            <w:tcMar>
-              <w:top w:w="90" w:type="dxa"/>
-              <w:start w:w="110" w:type="dxa"/>
-              <w:bottom w:w="90" w:type="dxa"/>
-              <w:end w:w="110" w:type="dxa"/>
-            </w:tcMar>
-            <w:vAlign w:val="center"/>
-            <w:shd w:fill="F5F7F8"/>
+              <w:t>Production access delay</w:t>
+            </w:r>
+          </w:p>
+        </w:tc>
+        <w:tc>
+          <w:tcPr>
+            <w:tcW w:type="dxa" w:w="1728"/>
+            <w:tcMar>
+              <w:top w:w="90" w:type="dxa"/>
+              <w:start w:w="110" w:type="dxa"/>
+              <w:bottom w:w="90" w:type="dxa"/>
+              <w:end w:w="110" w:type="dxa"/>
+            </w:tcMar>
+            <w:vAlign w:val="center"/>
+            <w:shd w:fill="FFFFFF"/>
           </w:tcPr>
           <w:p>
             <w:r/>
@@ -8952,7 +8590,57 @@
                 <w:color w:val="20272D"/>
                 <w:sz w:val="16"/>
               </w:rPr>
-              <w:t>Development Lead</w:t>
+              <w:t>Medium / Medium</w:t>
+            </w:r>
+          </w:p>
+        </w:tc>
+        <w:tc>
+          <w:tcPr>
+            <w:tcW w:type="dxa" w:w="5112"/>
+            <w:tcMar>
+              <w:top w:w="90" w:type="dxa"/>
+              <w:start w:w="110" w:type="dxa"/>
+              <w:bottom w:w="90" w:type="dxa"/>
+              <w:end w:w="110" w:type="dxa"/>
+            </w:tcMar>
+            <w:vAlign w:val="center"/>
+            <w:shd w:fill="FFFFFF"/>
+          </w:tcPr>
+          <w:p>
+            <w:r/>
+            <w:r>
+              <w:rPr>
+                <w:rFonts w:ascii="Aptos" w:hAnsi="Aptos"/>
+                <w:b w:val="0"/>
+                <w:color w:val="20272D"/>
+                <w:sz w:val="16"/>
+              </w:rPr>
+              <w:t>Finish local release package; maintain access checklist and schedule IT handoff before release.</w:t>
+            </w:r>
+          </w:p>
+        </w:tc>
+        <w:tc>
+          <w:tcPr>
+            <w:tcW w:type="dxa" w:w="1224"/>
+            <w:tcMar>
+              <w:top w:w="90" w:type="dxa"/>
+              <w:start w:w="110" w:type="dxa"/>
+              <w:bottom w:w="90" w:type="dxa"/>
+              <w:end w:w="110" w:type="dxa"/>
+            </w:tcMar>
+            <w:vAlign w:val="center"/>
+            <w:shd w:fill="FFFFFF"/>
+          </w:tcPr>
+          <w:p>
+            <w:r/>
+            <w:r>
+              <w:rPr>
+                <w:rFonts w:ascii="Aptos" w:hAnsi="Aptos"/>
+                <w:b w:val="0"/>
+                <w:color w:val="20272D"/>
+                <w:sz w:val="16"/>
+              </w:rPr>
+              <w:t>IT Manager</w:t>
             </w:r>
           </w:p>
         </w:tc>
@@ -8968,7 +8656,25 @@
               <w:end w:w="110" w:type="dxa"/>
             </w:tcMar>
             <w:vAlign w:val="center"/>
-            <w:shd w:fill="FFFFFF"/>
+            <w:shd w:fill="F5F7F8"/>
+          </w:tcPr>
+          <w:p>
+            <w:r>
+              <w:t>Static host route behavior</w:t>
+            </w:r>
+          </w:p>
+        </w:tc>
+        <w:tc>
+          <w:tcPr>
+            <w:tcW w:type="dxa" w:w="1728"/>
+            <w:tcMar>
+              <w:top w:w="90" w:type="dxa"/>
+              <w:start w:w="110" w:type="dxa"/>
+              <w:bottom w:w="90" w:type="dxa"/>
+              <w:end w:w="110" w:type="dxa"/>
+            </w:tcMar>
+            <w:vAlign w:val="center"/>
+            <w:shd w:fill="F5F7F8"/>
           </w:tcPr>
           <w:p>
             <w:r/>
@@ -8979,32 +8685,7 @@
                 <w:color w:val="20272D"/>
                 <w:sz w:val="16"/>
               </w:rPr>
-              <w:t>Production access delay</w:t>
-            </w:r>
-          </w:p>
-        </w:tc>
-        <w:tc>
-          <w:tcPr>
-            <w:tcW w:type="dxa" w:w="1728"/>
-            <w:tcMar>
-              <w:top w:w="90" w:type="dxa"/>
-              <w:start w:w="110" w:type="dxa"/>
-              <w:bottom w:w="90" w:type="dxa"/>
-              <w:end w:w="110" w:type="dxa"/>
-            </w:tcMar>
-            <w:vAlign w:val="center"/>
-            <w:shd w:fill="FFFFFF"/>
-          </w:tcPr>
-          <w:p>
-            <w:r/>
-            <w:r>
-              <w:rPr>
-                <w:rFonts w:ascii="Aptos" w:hAnsi="Aptos"/>
-                <w:b w:val="0"/>
-                <w:color w:val="20272D"/>
-                <w:sz w:val="16"/>
-              </w:rPr>
-              <w:t>Medium / Medium</w:t>
+              <w:t>Medium / High</w:t>
             </w:r>
           </w:p>
         </w:tc>
@@ -9018,120 +8699,11 @@
               <w:end w:w="110" w:type="dxa"/>
             </w:tcMar>
             <w:vAlign w:val="center"/>
-            <w:shd w:fill="FFFFFF"/>
-          </w:tcPr>
-          <w:p>
-            <w:r/>
-            <w:r>
-              <w:rPr>
-                <w:rFonts w:ascii="Aptos" w:hAnsi="Aptos"/>
-                <w:b w:val="0"/>
-                <w:color w:val="20272D"/>
-                <w:sz w:val="16"/>
-              </w:rPr>
-              <w:t>Finish local release package; maintain access checklist and schedule IT handoff before release.</w:t>
-            </w:r>
-          </w:p>
-        </w:tc>
-        <w:tc>
-          <w:tcPr>
-            <w:tcW w:type="dxa" w:w="1224"/>
-            <w:tcMar>
-              <w:top w:w="90" w:type="dxa"/>
-              <w:start w:w="110" w:type="dxa"/>
-              <w:bottom w:w="90" w:type="dxa"/>
-              <w:end w:w="110" w:type="dxa"/>
-            </w:tcMar>
-            <w:vAlign w:val="center"/>
-            <w:shd w:fill="FFFFFF"/>
-          </w:tcPr>
-          <w:p>
-            <w:r/>
-            <w:r>
-              <w:rPr>
-                <w:rFonts w:ascii="Aptos" w:hAnsi="Aptos"/>
-                <w:b w:val="0"/>
-                <w:color w:val="20272D"/>
-                <w:sz w:val="16"/>
-              </w:rPr>
-              <w:t>IT Manager</w:t>
-            </w:r>
-          </w:p>
-        </w:tc>
-      </w:tr>
-      <w:tr>
-        <w:tc>
-          <w:tcPr>
-            <w:tcW w:type="dxa" w:w="2448"/>
-            <w:tcMar>
-              <w:top w:w="90" w:type="dxa"/>
-              <w:start w:w="110" w:type="dxa"/>
-              <w:bottom w:w="90" w:type="dxa"/>
-              <w:end w:w="110" w:type="dxa"/>
-            </w:tcMar>
-            <w:vAlign w:val="center"/>
             <w:shd w:fill="F5F7F8"/>
           </w:tcPr>
           <w:p>
-            <w:r/>
-            <w:r>
-              <w:rPr>
-                <w:rFonts w:ascii="Aptos" w:hAnsi="Aptos"/>
-                <w:b w:val="0"/>
-                <w:color w:val="20272D"/>
-                <w:sz w:val="16"/>
-              </w:rPr>
-              <w:t>Plugin or theme incompatibility</w:t>
-            </w:r>
-          </w:p>
-        </w:tc>
-        <w:tc>
-          <w:tcPr>
-            <w:tcW w:type="dxa" w:w="1728"/>
-            <w:tcMar>
-              <w:top w:w="90" w:type="dxa"/>
-              <w:start w:w="110" w:type="dxa"/>
-              <w:bottom w:w="90" w:type="dxa"/>
-              <w:end w:w="110" w:type="dxa"/>
-            </w:tcMar>
-            <w:vAlign w:val="center"/>
-            <w:shd w:fill="F5F7F8"/>
-          </w:tcPr>
-          <w:p>
-            <w:r/>
-            <w:r>
-              <w:rPr>
-                <w:rFonts w:ascii="Aptos" w:hAnsi="Aptos"/>
-                <w:b w:val="0"/>
-                <w:color w:val="20272D"/>
-                <w:sz w:val="16"/>
-              </w:rPr>
-              <w:t>Medium / High</w:t>
-            </w:r>
-          </w:p>
-        </w:tc>
-        <w:tc>
-          <w:tcPr>
-            <w:tcW w:type="dxa" w:w="5112"/>
-            <w:tcMar>
-              <w:top w:w="90" w:type="dxa"/>
-              <w:start w:w="110" w:type="dxa"/>
-              <w:bottom w:w="90" w:type="dxa"/>
-              <w:end w:w="110" w:type="dxa"/>
-            </w:tcMar>
-            <w:vAlign w:val="center"/>
-            <w:shd w:fill="F5F7F8"/>
-          </w:tcPr>
-          <w:p>
-            <w:r/>
-            <w:r>
-              <w:rPr>
-                <w:rFonts w:ascii="Aptos" w:hAnsi="Aptos"/>
-                <w:b w:val="0"/>
-                <w:color w:val="20272D"/>
-                <w:sz w:val="16"/>
-              </w:rPr>
-              <w:t>Audit versions, build in compatible local environment, back up, stage, and maintain rollback.</w:t>
+            <w:r>
+              <w:t>Test generated route folders, trailing slashes, redirects, PDF delivery, and cache behavior on the selected staging host before release.</w:t>
             </w:r>
           </w:p>
         </w:tc>
@@ -9860,6 +9432,7 @@
     <w:p>
       <w:pPr>
         <w:pStyle w:val="Heading1"/>
+        <w:pageBreakBefore/>
       </w:pPr>
       <w:r>
         <w:t>13 Repository and Session Continuity</w:t>
@@ -9903,6 +9476,8 @@
       <w:tr>
         <w:trPr>
           <w:tblHeader/>
+          <w:cantSplit/>
+          <w:tblHeader w:val="true"/>
         </w:trPr>
         <w:tc>
           <w:tcPr>
@@ -9956,6 +9531,9 @@
         </w:tc>
       </w:tr>
       <w:tr>
+        <w:trPr>
+          <w:cantSplit/>
+        </w:trPr>
         <w:tc>
           <w:tcPr>
             <w:tcW w:type="dxa" w:w="2880"/>
@@ -10008,6 +9586,9 @@
         </w:tc>
       </w:tr>
       <w:tr>
+        <w:trPr>
+          <w:cantSplit/>
+        </w:trPr>
         <w:tc>
           <w:tcPr>
             <w:tcW w:type="dxa" w:w="2880"/>
@@ -10060,6 +9641,9 @@
         </w:tc>
       </w:tr>
       <w:tr>
+        <w:trPr>
+          <w:cantSplit/>
+        </w:trPr>
         <w:tc>
           <w:tcPr>
             <w:tcW w:type="dxa" w:w="2880"/>
@@ -10112,6 +9696,9 @@
         </w:tc>
       </w:tr>
       <w:tr>
+        <w:trPr>
+          <w:cantSplit/>
+        </w:trPr>
         <w:tc>
           <w:tcPr>
             <w:tcW w:type="dxa" w:w="2880"/>
@@ -10164,6 +9751,9 @@
         </w:tc>
       </w:tr>
       <w:tr>
+        <w:trPr>
+          <w:cantSplit/>
+        </w:trPr>
         <w:tc>
           <w:tcPr>
             <w:tcW w:type="dxa" w:w="2880"/>
@@ -10216,6 +9806,9 @@
         </w:tc>
       </w:tr>
       <w:tr>
+        <w:trPr>
+          <w:cantSplit/>
+        </w:trPr>
         <w:tc>
           <w:tcPr>
             <w:tcW w:type="dxa" w:w="2880"/>
@@ -10268,6 +9861,9 @@
         </w:tc>
       </w:tr>
       <w:tr>
+        <w:trPr>
+          <w:cantSplit/>
+        </w:trPr>
         <w:tc>
           <w:tcPr>
             <w:tcW w:type="dxa" w:w="2880"/>
@@ -10320,6 +9916,9 @@
         </w:tc>
       </w:tr>
       <w:tr>
+        <w:trPr>
+          <w:cantSplit/>
+        </w:trPr>
         <w:tc>
           <w:tcPr>
             <w:tcW w:type="dxa" w:w="2880"/>
@@ -10372,6 +9971,9 @@
         </w:tc>
       </w:tr>
       <w:tr>
+        <w:trPr>
+          <w:cantSplit/>
+        </w:trPr>
         <w:tc>
           <w:tcPr>
             <w:tcW w:type="dxa" w:w="2880"/>
@@ -10424,6 +10026,9 @@
         </w:tc>
       </w:tr>
       <w:tr>
+        <w:trPr>
+          <w:cantSplit/>
+        </w:trPr>
         <w:tc>
           <w:tcPr>
             <w:tcW w:type="dxa" w:w="2880"/>
@@ -10476,6 +10081,9 @@
         </w:tc>
       </w:tr>
       <w:tr>
+        <w:trPr>
+          <w:cantSplit/>
+        </w:trPr>
         <w:tc>
           <w:tcPr>
             <w:tcW w:type="dxa" w:w="2880"/>
@@ -10487,6 +10095,47 @@
             </w:tcMar>
             <w:vAlign w:val="center"/>
             <w:shd w:fill="FFFFFF"/>
+          </w:tcPr>
+          <w:p>
+            <w:r>
+              <w:t>next-app/</w:t>
+            </w:r>
+          </w:p>
+        </w:tc>
+        <w:tc>
+          <w:tcPr>
+            <w:tcW w:type="dxa" w:w="7344"/>
+            <w:tcMar>
+              <w:top w:w="90" w:type="dxa"/>
+              <w:start w:w="110" w:type="dxa"/>
+              <w:bottom w:w="90" w:type="dxa"/>
+              <w:end w:w="110" w:type="dxa"/>
+            </w:tcMar>
+            <w:vAlign w:val="center"/>
+            <w:shd w:fill="FFFFFF"/>
+          </w:tcPr>
+          <w:p>
+            <w:r>
+              <w:t>Selected Next.js and TypeScript static-export application, MDX Insights content, tests, assets, and deployment-safe configuration examples.</w:t>
+            </w:r>
+          </w:p>
+        </w:tc>
+      </w:tr>
+      <w:tr>
+        <w:trPr>
+          <w:cantSplit/>
+        </w:trPr>
+        <w:tc>
+          <w:tcPr>
+            <w:tcW w:type="dxa" w:w="2880"/>
+            <w:tcMar>
+              <w:top w:w="90" w:type="dxa"/>
+              <w:start w:w="110" w:type="dxa"/>
+              <w:bottom w:w="90" w:type="dxa"/>
+              <w:end w:w="110" w:type="dxa"/>
+            </w:tcMar>
+            <w:vAlign w:val="center"/>
+            <w:shd w:fill="F5F7F8"/>
           </w:tcPr>
           <w:p>
             <w:r/>
@@ -10497,7 +10146,7 @@
                 <w:color w:val="20272D"/>
                 <w:sz w:val="16"/>
               </w:rPr>
-              <w:t>wordpress/</w:t>
+              <w:t>backlog/</w:t>
             </w:r>
           </w:p>
         </w:tc>
@@ -10511,7 +10160,7 @@
               <w:end w:w="110" w:type="dxa"/>
             </w:tcMar>
             <w:vAlign w:val="center"/>
-            <w:shd w:fill="FFFFFF"/>
+            <w:shd w:fill="F5F7F8"/>
           </w:tcPr>
           <w:p>
             <w:r/>
@@ -10522,59 +10171,32 @@
                 <w:color w:val="20272D"/>
                 <w:sz w:val="16"/>
               </w:rPr>
-              <w:t>Child theme, custom plugin only if required, exports, and environment-safe configuration examples.</w:t>
+              <w:t>Prioritized backlog, sprint goals, and accepted work history.</w:t>
             </w:r>
           </w:p>
         </w:tc>
       </w:tr>
       <w:tr>
-        <w:tc>
-          <w:tcPr>
-            <w:tcW w:type="dxa" w:w="2880"/>
-            <w:tcMar>
-              <w:top w:w="90" w:type="dxa"/>
-              <w:start w:w="110" w:type="dxa"/>
-              <w:bottom w:w="90" w:type="dxa"/>
-              <w:end w:w="110" w:type="dxa"/>
-            </w:tcMar>
-            <w:vAlign w:val="center"/>
-            <w:shd w:fill="F5F7F8"/>
-          </w:tcPr>
-          <w:p>
-            <w:r/>
-            <w:r>
-              <w:rPr>
-                <w:rFonts w:ascii="Aptos" w:hAnsi="Aptos"/>
-                <w:b w:val="0"/>
-                <w:color w:val="20272D"/>
-                <w:sz w:val="16"/>
-              </w:rPr>
-              <w:t>backlog/</w:t>
-            </w:r>
-          </w:p>
-        </w:tc>
-        <w:tc>
-          <w:tcPr>
-            <w:tcW w:type="dxa" w:w="7344"/>
-            <w:tcMar>
-              <w:top w:w="90" w:type="dxa"/>
-              <w:start w:w="110" w:type="dxa"/>
-              <w:bottom w:w="90" w:type="dxa"/>
-              <w:end w:w="110" w:type="dxa"/>
-            </w:tcMar>
-            <w:vAlign w:val="center"/>
-            <w:shd w:fill="F5F7F8"/>
-          </w:tcPr>
-          <w:p>
-            <w:r/>
-            <w:r>
-              <w:rPr>
-                <w:rFonts w:ascii="Aptos" w:hAnsi="Aptos"/>
-                <w:b w:val="0"/>
-                <w:color w:val="20272D"/>
-                <w:sz w:val="16"/>
-              </w:rPr>
-              <w:t>Prioritized backlog, sprint goals, and accepted work history.</w:t>
+        <w:trPr>
+          <w:cantSplit/>
+        </w:trPr>
+        <w:tc>
+          <w:tcPr>
+            <w:tcW w:type="dxa" w:w="5083"/>
+          </w:tcPr>
+          <w:p>
+            <w:r>
+              <w:t>prototype/ and wordpress/</w:t>
+            </w:r>
+          </w:p>
+        </w:tc>
+        <w:tc>
+          <w:tcPr>
+            <w:tcW w:type="dxa" w:w="5083"/>
+          </w:tcPr>
+          <w:p>
+            <w:r>
+              <w:t>Preserved reference prototype and historical WordPress scaffold; not altered as part of the new review build.</w:t>
             </w:r>
           </w:p>
         </w:tc>
@@ -10638,7 +10260,7 @@
         <w:pStyle w:val="ListNumber"/>
       </w:pPr>
       <w:r>
-        <w:t>Commit all completed and documented work with a clear session-oriented message.</w:t>
+        <w:t>Keep repository changes and current status documented at the end of each session. Commit and push only when explicitly authorized for that release.</w:t>
       </w:r>
     </w:p>
     <w:p>
@@ -11217,7 +10839,7 @@
         <w:pStyle w:val="ListBullet"/>
       </w:pPr>
       <w:r>
-        <w:t>one.com and WordPress access supplied through an approved secure method, never stored in the repository.</w:t>
+        <w:t>Hosting and deployment access supplied through an approved secure method only after a production platform is selected and release is explicitly authorized; credentials are never stored in the repository.</w:t>
       </w:r>
     </w:p>
     <w:p>
@@ -11233,7 +10855,7 @@
         <w:pStyle w:val="ListBullet"/>
       </w:pPr>
       <w:r>
-        <w:t>Production PHP, WordPress, theme, plugin, caching, email, DNS, SSL, and storage constraints documented.</w:t>
+        <w:t>Target hosting build support, domain and DNS controls, forms/email, scheduling, analytics, SSL, caching, privacy, and security constraints documented and approved.</w:t>
       </w:r>
     </w:p>
     <w:p>
@@ -11281,7 +10903,7 @@
         <w:pStyle w:val="ListNumber"/>
       </w:pPr>
       <w:r>
-        <w:t>Deploy child theme, approved templates, optimized assets, and required configuration.</w:t>
+        <w:t>Deploy the statically exported files to a staging or test destination after IT selects and approves the target host.</w:t>
       </w:r>
     </w:p>
     <w:p>
@@ -11289,7 +10911,7 @@
         <w:pStyle w:val="ListNumber"/>
       </w:pPr>
       <w:r>
-        <w:t>Apply content and redirects through the controlled migration method.</w:t>
+        <w:t>Verify static route behavior, redirects, metadata, assets, and the capability PDF against the approved site map.</w:t>
       </w:r>
     </w:p>
     <w:p>
@@ -11297,7 +10919,7 @@
         <w:pStyle w:val="ListNumber"/>
       </w:pPr>
       <w:r>
-        <w:t>Clear caches and perform production smoke tests.</w:t>
+        <w:t>Clear or invalidate the selected host's cache where applicable, then perform a production smoke test after separately authorized release.</w:t>
       </w:r>
     </w:p>
     <w:p>
@@ -11305,7 +10927,7 @@
         <w:pStyle w:val="ListNumber"/>
       </w:pPr>
       <w:r>
-        <w:t>Verify forms, email, downloads, analytics, robots, sitemap, SSL, responsive layouts, and key search metadata.</w:t>
+        <w:t>Verify route responses, forms and email behavior, downloads, analytics if approved, robots, sitemap, SSL, responsive layouts, and search metadata.</w:t>
       </w:r>
     </w:p>
     <w:p>
@@ -11337,7 +10959,7 @@
         <w:pStyle w:val="ListBullet"/>
       </w:pPr>
       <w:r>
-        <w:t>Production-ready WordPress child theme and approved custom code.</w:t>
+        <w:t>Accepted application source and deployment configuration for the production platform selected at a later approval gate.</w:t>
       </w:r>
     </w:p>
     <w:p>
@@ -11345,7 +10967,7 @@
         <w:pStyle w:val="ListBullet"/>
       </w:pPr>
       <w:r>
-        <w:t>Elementor templates or documented exports where appropriate.</w:t>
+        <w:t>Reusable page components, content authoring guidance, and verified deployment documentation.</w:t>
       </w:r>
     </w:p>
     <w:p>
@@ -12309,7 +11931,7 @@
         <w:pStyle w:val="ListBullet"/>
       </w:pPr>
       <w:r>
-        <w:t>The current WordPress, Blocksy, Elementor, and one.com environment remains the intended production platform.</w:t>
+        <w:t>The current WordPress/one.com website remains live and unchanged. The new Next.js application is a separate review build; production hosting and migration are undecided and require IT review and explicit approval.</w:t>
       </w:r>
     </w:p>
     <w:p>
@@ -12559,15 +12181,50 @@
             <w:shd w:fill="FFFFFF"/>
           </w:tcPr>
           <w:p>
-            <w:r/>
-            <w:r>
-              <w:rPr>
-                <w:rFonts w:ascii="Aptos" w:hAnsi="Aptos"/>
-                <w:b w:val="0"/>
-                <w:color w:val="20272D"/>
-                <w:sz w:val="16"/>
-              </w:rPr>
-              <w:t>Proposed</w:t>
+            <w:r>
+              <w:t>Superseded by 1.1</w:t>
+            </w:r>
+          </w:p>
+        </w:tc>
+      </w:tr>
+      <w:tr>
+        <w:tc>
+          <w:tcPr>
+            <w:tcW w:type="dxa" w:w="2541"/>
+          </w:tcPr>
+          <w:p>
+            <w:r>
+              <w:t>1.1</w:t>
+            </w:r>
+          </w:p>
+        </w:tc>
+        <w:tc>
+          <w:tcPr>
+            <w:tcW w:type="dxa" w:w="2541"/>
+          </w:tcPr>
+          <w:p>
+            <w:r>
+              <w:t>30 September 2026</w:t>
+            </w:r>
+          </w:p>
+        </w:tc>
+        <w:tc>
+          <w:tcPr>
+            <w:tcW w:type="dxa" w:w="2541"/>
+          </w:tcPr>
+          <w:p>
+            <w:r>
+              <w:t>Approved architecture amendment: separate Next.js/TypeScript review build, MDX Insights, no initial CMS/database, production unchanged</w:t>
+            </w:r>
+          </w:p>
+        </w:tc>
+        <w:tc>
+          <w:tcPr>
+            <w:tcW w:type="dxa" w:w="2541"/>
+          </w:tcPr>
+          <w:p>
+            <w:r>
+              <w:t>Approved for local review build</w:t>
             </w:r>
           </w:p>
         </w:tc>
@@ -13146,9 +12803,8 @@
       <w:jc w:val="right"/>
     </w:pPr>
     <w:r>
-      <w:t xml:space="preserve">PROGRAM PLAN  |  VERSION 1.0  |  16 SEPTEMBER 2026  |  </w:t>
+      <w:t xml:space="preserve">PROGRAM PLAN  |  VERSION 1.1  |  30 SEPTEMBER 2026  |  </w:t>
     </w:r>
-    <w:fldSimple w:instr="PAGE"/>
   </w:p>
 </w:ftr>
 </file>

</xml_diff>